<commit_message>
aaaa aaaa aaa aa
</commit_message>
<xml_diff>
--- a/UI_UX/лабораторные/Лабораторная работа №10.docx
+++ b/UI_UX/лабораторные/Лабораторная работа №10.docx
@@ -28,7 +28,6 @@
           <w:b/>
           <w:sz w:val="28"/>
           <w:szCs w:val="28"/>
-          <w:lang w:val="en-US"/>
         </w:rPr>
         <w:t>10</w:t>
       </w:r>
@@ -956,7 +955,7 @@
           <w:lang w:eastAsia="ru-RU"/>
         </w:rPr>
         <w:drawing>
-          <wp:inline distT="0" distB="0" distL="0" distR="0" wp14:anchorId="19C2314A" wp14:editId="49E9A106">
+          <wp:inline distT="0" distB="0" distL="0" distR="0" wp14:anchorId="5FD9F22D" wp14:editId="472C85C8">
             <wp:extent cx="4291263" cy="2344747"/>
             <wp:effectExtent l="0" t="0" r="0" b="0"/>
             <wp:docPr id="10" name="Рисунок 10" descr="https://deadsign.ru/images/articles/10_typography/10_typography_3.png"/>
@@ -1252,7 +1251,7 @@
           <w:lang w:eastAsia="ru-RU"/>
         </w:rPr>
         <w:drawing>
-          <wp:inline distT="0" distB="0" distL="0" distR="0" wp14:anchorId="44158C83" wp14:editId="09BC5F9A">
+          <wp:inline distT="0" distB="0" distL="0" distR="0" wp14:anchorId="121536E8" wp14:editId="52E80F50">
             <wp:extent cx="5069305" cy="1445351"/>
             <wp:effectExtent l="0" t="0" r="0" b="2540"/>
             <wp:docPr id="8" name="Рисунок 8" descr="C:\Users\Say My Name\Downloads\Frame 54.jpg"/>
@@ -1423,7 +1422,7 @@
         </w:rPr>
         <w:lastRenderedPageBreak/>
         <w:drawing>
-          <wp:inline distT="0" distB="0" distL="0" distR="0">
+          <wp:inline distT="0" distB="0" distL="0" distR="0" wp14:anchorId="2BA05046" wp14:editId="40344999">
             <wp:extent cx="3200400" cy="1894579"/>
             <wp:effectExtent l="0" t="0" r="0" b="0"/>
             <wp:docPr id="31" name="Рисунок 31" descr="C:\Users\Say My Name\Downloads\Frame 55 (2).jpg"/>
@@ -1715,7 +1714,7 @@
           <w:lang w:eastAsia="ru-RU"/>
         </w:rPr>
         <w:drawing>
-          <wp:inline distT="0" distB="0" distL="0" distR="0" wp14:anchorId="5C5E2EE6" wp14:editId="243A1D93">
+          <wp:inline distT="0" distB="0" distL="0" distR="0" wp14:anchorId="30F846F4" wp14:editId="3FC6C659">
             <wp:extent cx="3956783" cy="2310063"/>
             <wp:effectExtent l="0" t="0" r="5715" b="0"/>
             <wp:docPr id="67" name="Рисунок 67" descr="C:\Users\Say My Name\Downloads\Frame 56.jpg"/>
@@ -1908,7 +1907,7 @@
         </w:rPr>
         <w:lastRenderedPageBreak/>
         <w:drawing>
-          <wp:inline distT="0" distB="0" distL="0" distR="0" wp14:anchorId="7B18B848" wp14:editId="7E629DDC">
+          <wp:inline distT="0" distB="0" distL="0" distR="0" wp14:anchorId="47B417A7" wp14:editId="62FC3AE8">
             <wp:extent cx="3785937" cy="2102983"/>
             <wp:effectExtent l="0" t="0" r="5080" b="0"/>
             <wp:docPr id="69" name="Рисунок 69" descr="C:\Users\Say My Name\Downloads\Frame 56 (1).jpg"/>
@@ -2083,7 +2082,7 @@
           <w:lang w:eastAsia="ru-RU"/>
         </w:rPr>
         <w:drawing>
-          <wp:inline distT="0" distB="0" distL="0" distR="0">
+          <wp:inline distT="0" distB="0" distL="0" distR="0" wp14:anchorId="016CBCF0" wp14:editId="4398F0D2">
             <wp:extent cx="3545305" cy="1969319"/>
             <wp:effectExtent l="0" t="0" r="0" b="0"/>
             <wp:docPr id="71" name="Рисунок 71" descr="C:\Users\Say My Name\Downloads\Frame 57.jpg"/>
@@ -2239,7 +2238,7 @@
           <w:lang w:eastAsia="ru-RU"/>
         </w:rPr>
         <w:drawing>
-          <wp:inline distT="0" distB="0" distL="0" distR="0" wp14:anchorId="2D0BC2EA" wp14:editId="3741649F">
+          <wp:inline distT="0" distB="0" distL="0" distR="0" wp14:anchorId="5D5B7384" wp14:editId="186B8258">
             <wp:extent cx="3992011" cy="1828800"/>
             <wp:effectExtent l="0" t="0" r="8890" b="0"/>
             <wp:docPr id="73" name="Рисунок 73" descr="C:\Users\Say My Name\Downloads\Frame 58.jpg"/>
@@ -2427,7 +2426,7 @@
           <w:lang w:eastAsia="ru-RU"/>
         </w:rPr>
         <w:drawing>
-          <wp:inline distT="0" distB="0" distL="0" distR="0" wp14:anchorId="2F98E357" wp14:editId="17563D00">
+          <wp:inline distT="0" distB="0" distL="0" distR="0" wp14:anchorId="6F743951" wp14:editId="58C7BFFA">
             <wp:extent cx="4527972" cy="2502569"/>
             <wp:effectExtent l="0" t="0" r="6350" b="0"/>
             <wp:docPr id="1" name="Рисунок 1" descr="C:\Users\Say My Name\Downloads\Frame 59.jpg"/>
@@ -2614,7 +2613,7 @@
           <w:lang w:eastAsia="ru-RU"/>
         </w:rPr>
         <w:drawing>
-          <wp:inline distT="0" distB="0" distL="0" distR="0" wp14:anchorId="7B08F45B" wp14:editId="2193320F">
+          <wp:inline distT="0" distB="0" distL="0" distR="0" wp14:anchorId="021CB4DD" wp14:editId="22532A00">
             <wp:extent cx="5811524" cy="2261937"/>
             <wp:effectExtent l="0" t="0" r="0" b="5080"/>
             <wp:docPr id="4" name="Рисунок 4" descr="C:\Users\Say My Name\Downloads\Frame 64.jpg"/>
@@ -2778,7 +2777,7 @@
         </w:rPr>
         <w:lastRenderedPageBreak/>
         <w:drawing>
-          <wp:inline distT="0" distB="0" distL="0" distR="0" wp14:anchorId="5FCC7B39" wp14:editId="42A0344A">
+          <wp:inline distT="0" distB="0" distL="0" distR="0" wp14:anchorId="6B7EFFD1" wp14:editId="0228E027">
             <wp:extent cx="2229853" cy="2181681"/>
             <wp:effectExtent l="0" t="0" r="0" b="9525"/>
             <wp:docPr id="9" name="Рисунок 9" descr="C:\Users\Say My Name\Downloads\Frame 65.jpg"/>
@@ -2949,7 +2948,7 @@
           <w:lang w:eastAsia="ru-RU"/>
         </w:rPr>
         <w:drawing>
-          <wp:inline distT="0" distB="0" distL="0" distR="0" wp14:anchorId="25056B7F" wp14:editId="5BF9AD1E">
+          <wp:inline distT="0" distB="0" distL="0" distR="0" wp14:anchorId="752BE8F2" wp14:editId="30946F46">
             <wp:extent cx="3063713" cy="1925052"/>
             <wp:effectExtent l="0" t="0" r="3810" b="0"/>
             <wp:docPr id="13" name="Рисунок 13" descr="C:\Users\Say My Name\Downloads\Frame 66.jpg"/>
@@ -3120,7 +3119,7 @@
           <w:lang w:eastAsia="ru-RU"/>
         </w:rPr>
         <w:drawing>
-          <wp:inline distT="0" distB="0" distL="0" distR="0" wp14:anchorId="6341A2EB" wp14:editId="6813F0D4">
+          <wp:inline distT="0" distB="0" distL="0" distR="0" wp14:anchorId="497D9570" wp14:editId="71DACEB0">
             <wp:extent cx="4499811" cy="1982477"/>
             <wp:effectExtent l="0" t="0" r="0" b="0"/>
             <wp:docPr id="17" name="Рисунок 17" descr="C:\Users\Say My Name\Downloads\Frame 15 (1).jpg"/>
@@ -3432,7 +3431,7 @@
           <w:lang w:eastAsia="ru-RU"/>
         </w:rPr>
         <w:drawing>
-          <wp:inline distT="0" distB="0" distL="0" distR="0" wp14:anchorId="605D469B" wp14:editId="756A97E0">
+          <wp:inline distT="0" distB="0" distL="0" distR="0" wp14:anchorId="72383071" wp14:editId="70A75EA7">
             <wp:extent cx="4371474" cy="2002637"/>
             <wp:effectExtent l="0" t="0" r="0" b="0"/>
             <wp:docPr id="19" name="Рисунок 19" descr="C:\Users\Say My Name\Downloads\Frame 67.jpg"/>
@@ -3658,7 +3657,7 @@
           <w:lang w:eastAsia="ru-RU"/>
         </w:rPr>
         <w:drawing>
-          <wp:inline distT="0" distB="0" distL="0" distR="0">
+          <wp:inline distT="0" distB="0" distL="0" distR="0" wp14:anchorId="5FE71365" wp14:editId="75909FBB">
             <wp:extent cx="4355431" cy="1253928"/>
             <wp:effectExtent l="0" t="0" r="7620" b="3810"/>
             <wp:docPr id="12" name="Рисунок 12" descr="C:\Users\Say My Name\Downloads\Frame 62 (1).jpg"/>
@@ -3853,7 +3852,7 @@
         </w:rPr>
         <w:lastRenderedPageBreak/>
         <w:drawing>
-          <wp:inline distT="0" distB="0" distL="0" distR="0">
+          <wp:inline distT="0" distB="0" distL="0" distR="0" wp14:anchorId="2E56A803" wp14:editId="4D7838E8">
             <wp:extent cx="2462463" cy="872473"/>
             <wp:effectExtent l="0" t="0" r="0" b="4445"/>
             <wp:docPr id="5" name="Рисунок 5" descr="C:\Users\Say My Name\Downloads\Frame 60.jpg"/>
@@ -4061,7 +4060,7 @@
           <w:lang w:eastAsia="ru-RU"/>
         </w:rPr>
         <w:drawing>
-          <wp:inline distT="0" distB="0" distL="0" distR="0" wp14:anchorId="42CCDC5A" wp14:editId="482E49BA">
+          <wp:inline distT="0" distB="0" distL="0" distR="0" wp14:anchorId="182BF081" wp14:editId="68B63EA1">
             <wp:extent cx="4202464" cy="2101457"/>
             <wp:effectExtent l="0" t="0" r="7620" b="0"/>
             <wp:docPr id="7" name="Рисунок 7" descr="C:\Users\Say My Name\Downloads\Frame 61.jpg"/>
@@ -4191,7 +4190,7 @@
           <w:lang w:eastAsia="ru-RU"/>
         </w:rPr>
         <w:drawing>
-          <wp:inline distT="0" distB="0" distL="0" distR="0">
+          <wp:inline distT="0" distB="0" distL="0" distR="0" wp14:anchorId="328DA86A" wp14:editId="7F82C2FF">
             <wp:extent cx="4209165" cy="2855495"/>
             <wp:effectExtent l="0" t="0" r="1270" b="2540"/>
             <wp:docPr id="22" name="Рисунок 22" descr="C:\Users\Say My Name\Downloads\Frame 69.jpg"/>
@@ -4369,7 +4368,7 @@
         </w:rPr>
         <w:lastRenderedPageBreak/>
         <w:drawing>
-          <wp:inline distT="0" distB="0" distL="0" distR="0">
+          <wp:inline distT="0" distB="0" distL="0" distR="0" wp14:anchorId="567F9E55" wp14:editId="78E9F9B8">
             <wp:extent cx="4323347" cy="1273831"/>
             <wp:effectExtent l="0" t="0" r="1270" b="2540"/>
             <wp:docPr id="3" name="Рисунок 3" descr="C:\Users\Say My Name\Downloads\Frame 29 (1).jpg"/>
@@ -4570,7 +4569,7 @@
           <w:lang w:eastAsia="ru-RU"/>
         </w:rPr>
         <w:drawing>
-          <wp:inline distT="0" distB="0" distL="0" distR="0" wp14:anchorId="7B2778F5" wp14:editId="2F56E9D8">
+          <wp:inline distT="0" distB="0" distL="0" distR="0" wp14:anchorId="431DF5B0" wp14:editId="6F6745DD">
             <wp:extent cx="3553326" cy="2479471"/>
             <wp:effectExtent l="0" t="0" r="0" b="0"/>
             <wp:docPr id="27" name="Рисунок 27"/>
@@ -4729,7 +4728,7 @@
           <w:lang w:eastAsia="ru-RU"/>
         </w:rPr>
         <w:drawing>
-          <wp:inline distT="0" distB="0" distL="0" distR="0" wp14:anchorId="01A25CFC" wp14:editId="4CD5D4B6">
+          <wp:inline distT="0" distB="0" distL="0" distR="0" wp14:anchorId="67F022D3" wp14:editId="0274D618">
             <wp:extent cx="5379991" cy="2486527"/>
             <wp:effectExtent l="0" t="0" r="0" b="9525"/>
             <wp:docPr id="14" name="Рисунок 14" descr="C:\Users\Say My Name\Downloads\Frame 63.jpg"/>
@@ -4946,7 +4945,6 @@
         </w:rPr>
         <w:t>Размер текста в кнопке для десктопа может быть в диапазоне 14-20</w:t>
       </w:r>
-      <w:proofErr w:type="spellStart"/>
       <w:r>
         <w:rPr>
           <w:rFonts w:ascii="Times New Roman" w:hAnsi="Times New Roman" w:cs="Times New Roman"/>
@@ -4956,7 +4954,6 @@
         </w:rPr>
         <w:t>pt</w:t>
       </w:r>
-      <w:proofErr w:type="spellEnd"/>
       <w:r>
         <w:rPr>
           <w:rFonts w:ascii="Times New Roman" w:hAnsi="Times New Roman" w:cs="Times New Roman"/>
@@ -5053,7 +5050,7 @@
           <w:lang w:eastAsia="ru-RU"/>
         </w:rPr>
         <w:drawing>
-          <wp:inline distT="0" distB="0" distL="0" distR="0">
+          <wp:inline distT="0" distB="0" distL="0" distR="0" wp14:anchorId="5745F73D" wp14:editId="322AB28F">
             <wp:extent cx="3585210" cy="1932940"/>
             <wp:effectExtent l="0" t="0" r="0" b="0"/>
             <wp:docPr id="26" name="Рисунок 26" descr="C:\Users\Say My Name\Downloads\Frame 71.jpg"/>
@@ -5184,7 +5181,6 @@
           <w:b/>
           <w:sz w:val="28"/>
           <w:szCs w:val="28"/>
-          <w:lang w:val="en-US"/>
         </w:rPr>
       </w:pPr>
       <w:r>
@@ -5202,7 +5198,6 @@
           <w:b/>
           <w:sz w:val="28"/>
           <w:szCs w:val="28"/>
-          <w:lang w:val="en-US"/>
         </w:rPr>
         <w:t>10</w:t>
       </w:r>
@@ -5506,6 +5501,66 @@
         <w:tabs>
           <w:tab w:val="left" w:pos="1134"/>
         </w:tabs>
+        <w:spacing w:before="240" w:after="0" w:line="240" w:lineRule="auto"/>
+        <w:jc w:val="both"/>
+        <w:rPr>
+          <w:rFonts w:ascii="Times New Roman" w:hAnsi="Times New Roman" w:cs="Times New Roman"/>
+          <w:sz w:val="28"/>
+          <w:szCs w:val="28"/>
+          <w:lang w:val="en-US"/>
+        </w:rPr>
+      </w:pPr>
+    </w:p>
+    <w:p>
+      <w:pPr>
+        <w:tabs>
+          <w:tab w:val="left" w:pos="1134"/>
+        </w:tabs>
+        <w:spacing w:before="240" w:after="0" w:line="240" w:lineRule="auto"/>
+        <w:jc w:val="both"/>
+        <w:rPr>
+          <w:rFonts w:ascii="Times New Roman" w:hAnsi="Times New Roman" w:cs="Times New Roman"/>
+          <w:sz w:val="28"/>
+          <w:szCs w:val="28"/>
+          <w:lang w:val="en-US"/>
+        </w:rPr>
+      </w:pPr>
+    </w:p>
+    <w:p>
+      <w:pPr>
+        <w:tabs>
+          <w:tab w:val="left" w:pos="1134"/>
+        </w:tabs>
+        <w:spacing w:before="240" w:after="0" w:line="240" w:lineRule="auto"/>
+        <w:jc w:val="both"/>
+        <w:rPr>
+          <w:rFonts w:ascii="Times New Roman" w:hAnsi="Times New Roman" w:cs="Times New Roman"/>
+          <w:sz w:val="28"/>
+          <w:szCs w:val="28"/>
+          <w:lang w:val="en-US"/>
+        </w:rPr>
+      </w:pPr>
+    </w:p>
+    <w:p>
+      <w:pPr>
+        <w:tabs>
+          <w:tab w:val="left" w:pos="1134"/>
+        </w:tabs>
+        <w:spacing w:before="240" w:after="0" w:line="240" w:lineRule="auto"/>
+        <w:jc w:val="both"/>
+        <w:rPr>
+          <w:rFonts w:ascii="Times New Roman" w:hAnsi="Times New Roman" w:cs="Times New Roman"/>
+          <w:sz w:val="28"/>
+          <w:szCs w:val="28"/>
+          <w:lang w:val="en-US"/>
+        </w:rPr>
+      </w:pPr>
+    </w:p>
+    <w:p>
+      <w:pPr>
+        <w:tabs>
+          <w:tab w:val="left" w:pos="1134"/>
+        </w:tabs>
         <w:spacing w:before="240" w:after="240"/>
         <w:jc w:val="center"/>
         <w:rPr>
@@ -5522,6 +5577,7 @@
           <w:sz w:val="28"/>
           <w:szCs w:val="28"/>
         </w:rPr>
+        <w:lastRenderedPageBreak/>
         <w:t>Контрольные вопросы</w:t>
       </w:r>
       <w:r>
@@ -5597,6 +5653,280 @@
     </w:p>
     <w:p>
       <w:pPr>
+        <w:tabs>
+          <w:tab w:val="left" w:pos="851"/>
+        </w:tabs>
+        <w:spacing w:after="0" w:line="240" w:lineRule="auto"/>
+        <w:ind w:firstLine="709"/>
+        <w:jc w:val="both"/>
+        <w:rPr>
+          <w:rFonts w:ascii="Times New Roman" w:hAnsi="Times New Roman" w:cs="Times New Roman"/>
+          <w:sz w:val="28"/>
+          <w:szCs w:val="28"/>
+        </w:rPr>
+      </w:pPr>
+      <w:r>
+        <w:rPr>
+          <w:rFonts w:ascii="Times New Roman" w:hAnsi="Times New Roman" w:cs="Times New Roman"/>
+          <w:b/>
+          <w:sz w:val="28"/>
+          <w:szCs w:val="28"/>
+        </w:rPr>
+        <w:t>Типографика</w:t>
+      </w:r>
+      <w:r>
+        <w:rPr>
+          <w:rFonts w:ascii="Times New Roman" w:hAnsi="Times New Roman" w:cs="Times New Roman"/>
+          <w:sz w:val="28"/>
+          <w:szCs w:val="28"/>
+        </w:rPr>
+        <w:t xml:space="preserve"> — это графическое оформление текста, </w:t>
+      </w:r>
+      <w:r>
+        <w:rPr>
+          <w:rFonts w:ascii="Times New Roman" w:hAnsi="Times New Roman" w:cs="Times New Roman"/>
+          <w:sz w:val="28"/>
+          <w:szCs w:val="28"/>
+        </w:rPr>
+        <w:t>система оформления текста, с помощью шрифтов, символов и знаков. Она помогает сделать написанный текст приятный и более читабельным для пользователя и читателя.</w:t>
+      </w:r>
+    </w:p>
+    <w:p>
+      <w:pPr>
+        <w:tabs>
+          <w:tab w:val="left" w:pos="851"/>
+        </w:tabs>
+        <w:spacing w:after="0" w:line="240" w:lineRule="auto"/>
+        <w:ind w:firstLine="709"/>
+        <w:jc w:val="both"/>
+        <w:rPr>
+          <w:rFonts w:ascii="Times New Roman" w:hAnsi="Times New Roman" w:cs="Times New Roman"/>
+          <w:sz w:val="28"/>
+          <w:szCs w:val="28"/>
+        </w:rPr>
+      </w:pPr>
+      <w:r>
+        <w:rPr>
+          <w:rFonts w:ascii="Times New Roman" w:hAnsi="Times New Roman" w:cs="Times New Roman"/>
+          <w:sz w:val="28"/>
+          <w:szCs w:val="28"/>
+        </w:rPr>
+        <w:t>Типографика включает в себя:</w:t>
+      </w:r>
+    </w:p>
+    <w:p>
+      <w:pPr>
+        <w:pStyle w:val="a3"/>
+        <w:numPr>
+          <w:ilvl w:val="0"/>
+          <w:numId w:val="20"/>
+        </w:numPr>
+        <w:tabs>
+          <w:tab w:val="left" w:pos="993"/>
+        </w:tabs>
+        <w:spacing w:after="0" w:line="240" w:lineRule="auto"/>
+        <w:ind w:left="0" w:firstLine="709"/>
+        <w:jc w:val="both"/>
+        <w:rPr>
+          <w:rFonts w:ascii="Times New Roman" w:hAnsi="Times New Roman" w:cs="Times New Roman"/>
+          <w:sz w:val="28"/>
+          <w:szCs w:val="28"/>
+        </w:rPr>
+      </w:pPr>
+      <w:r>
+        <w:rPr>
+          <w:rFonts w:ascii="Times New Roman" w:hAnsi="Times New Roman" w:cs="Times New Roman"/>
+          <w:sz w:val="28"/>
+          <w:szCs w:val="28"/>
+        </w:rPr>
+        <w:t>Разработку шрифта.</w:t>
+      </w:r>
+    </w:p>
+    <w:p>
+      <w:pPr>
+        <w:pStyle w:val="a3"/>
+        <w:numPr>
+          <w:ilvl w:val="0"/>
+          <w:numId w:val="20"/>
+        </w:numPr>
+        <w:tabs>
+          <w:tab w:val="left" w:pos="993"/>
+        </w:tabs>
+        <w:spacing w:after="0" w:line="240" w:lineRule="auto"/>
+        <w:ind w:left="0" w:firstLine="709"/>
+        <w:jc w:val="both"/>
+        <w:rPr>
+          <w:rFonts w:ascii="Times New Roman" w:hAnsi="Times New Roman" w:cs="Times New Roman"/>
+          <w:sz w:val="28"/>
+          <w:szCs w:val="28"/>
+        </w:rPr>
+      </w:pPr>
+      <w:r>
+        <w:rPr>
+          <w:rFonts w:ascii="Times New Roman" w:hAnsi="Times New Roman" w:cs="Times New Roman"/>
+          <w:sz w:val="28"/>
+          <w:szCs w:val="28"/>
+        </w:rPr>
+        <w:t>Подбор и сочетание шрифтов.</w:t>
+      </w:r>
+    </w:p>
+    <w:p>
+      <w:pPr>
+        <w:pStyle w:val="a3"/>
+        <w:numPr>
+          <w:ilvl w:val="0"/>
+          <w:numId w:val="20"/>
+        </w:numPr>
+        <w:tabs>
+          <w:tab w:val="left" w:pos="993"/>
+        </w:tabs>
+        <w:spacing w:after="0" w:line="240" w:lineRule="auto"/>
+        <w:ind w:left="0" w:firstLine="709"/>
+        <w:jc w:val="both"/>
+        <w:rPr>
+          <w:rFonts w:ascii="Times New Roman" w:hAnsi="Times New Roman" w:cs="Times New Roman"/>
+          <w:sz w:val="28"/>
+          <w:szCs w:val="28"/>
+        </w:rPr>
+      </w:pPr>
+      <w:r>
+        <w:rPr>
+          <w:rFonts w:ascii="Times New Roman" w:hAnsi="Times New Roman" w:cs="Times New Roman"/>
+          <w:sz w:val="28"/>
+          <w:szCs w:val="28"/>
+        </w:rPr>
+        <w:t>Начертания шрифта.</w:t>
+      </w:r>
+    </w:p>
+    <w:p>
+      <w:pPr>
+        <w:pStyle w:val="a3"/>
+        <w:numPr>
+          <w:ilvl w:val="0"/>
+          <w:numId w:val="20"/>
+        </w:numPr>
+        <w:tabs>
+          <w:tab w:val="left" w:pos="993"/>
+        </w:tabs>
+        <w:spacing w:after="0" w:line="240" w:lineRule="auto"/>
+        <w:ind w:left="0" w:firstLine="709"/>
+        <w:jc w:val="both"/>
+        <w:rPr>
+          <w:rFonts w:ascii="Times New Roman" w:hAnsi="Times New Roman" w:cs="Times New Roman"/>
+          <w:sz w:val="28"/>
+          <w:szCs w:val="28"/>
+        </w:rPr>
+      </w:pPr>
+      <w:r>
+        <w:rPr>
+          <w:rFonts w:ascii="Times New Roman" w:hAnsi="Times New Roman" w:cs="Times New Roman"/>
+          <w:sz w:val="28"/>
+          <w:szCs w:val="28"/>
+        </w:rPr>
+        <w:t>Плотность шрифта.</w:t>
+      </w:r>
+    </w:p>
+    <w:p>
+      <w:pPr>
+        <w:pStyle w:val="a3"/>
+        <w:numPr>
+          <w:ilvl w:val="0"/>
+          <w:numId w:val="20"/>
+        </w:numPr>
+        <w:tabs>
+          <w:tab w:val="left" w:pos="993"/>
+        </w:tabs>
+        <w:spacing w:after="0" w:line="240" w:lineRule="auto"/>
+        <w:ind w:left="0" w:firstLine="709"/>
+        <w:jc w:val="both"/>
+        <w:rPr>
+          <w:rFonts w:ascii="Times New Roman" w:hAnsi="Times New Roman" w:cs="Times New Roman"/>
+          <w:sz w:val="28"/>
+          <w:szCs w:val="28"/>
+        </w:rPr>
+      </w:pPr>
+      <w:r>
+        <w:rPr>
+          <w:rFonts w:ascii="Times New Roman" w:hAnsi="Times New Roman" w:cs="Times New Roman"/>
+          <w:sz w:val="28"/>
+          <w:szCs w:val="28"/>
+        </w:rPr>
+        <w:t>Соотношение размеров.</w:t>
+      </w:r>
+    </w:p>
+    <w:p>
+      <w:pPr>
+        <w:pStyle w:val="a3"/>
+        <w:numPr>
+          <w:ilvl w:val="0"/>
+          <w:numId w:val="20"/>
+        </w:numPr>
+        <w:tabs>
+          <w:tab w:val="left" w:pos="993"/>
+        </w:tabs>
+        <w:spacing w:after="0" w:line="240" w:lineRule="auto"/>
+        <w:ind w:left="0" w:firstLine="709"/>
+        <w:jc w:val="both"/>
+        <w:rPr>
+          <w:rFonts w:ascii="Times New Roman" w:hAnsi="Times New Roman" w:cs="Times New Roman"/>
+          <w:sz w:val="28"/>
+          <w:szCs w:val="28"/>
+        </w:rPr>
+      </w:pPr>
+      <w:r>
+        <w:rPr>
+          <w:rFonts w:ascii="Times New Roman" w:hAnsi="Times New Roman" w:cs="Times New Roman"/>
+          <w:sz w:val="28"/>
+          <w:szCs w:val="28"/>
+        </w:rPr>
+        <w:t>Оформление и расположение текстовых блоков.</w:t>
+      </w:r>
+    </w:p>
+    <w:p>
+      <w:pPr>
+        <w:pStyle w:val="a3"/>
+        <w:numPr>
+          <w:ilvl w:val="0"/>
+          <w:numId w:val="20"/>
+        </w:numPr>
+        <w:tabs>
+          <w:tab w:val="left" w:pos="993"/>
+        </w:tabs>
+        <w:spacing w:after="0" w:line="240" w:lineRule="auto"/>
+        <w:ind w:left="0" w:firstLine="709"/>
+        <w:jc w:val="both"/>
+        <w:rPr>
+          <w:rFonts w:ascii="Times New Roman" w:hAnsi="Times New Roman" w:cs="Times New Roman"/>
+          <w:sz w:val="28"/>
+          <w:szCs w:val="28"/>
+        </w:rPr>
+      </w:pPr>
+      <w:r>
+        <w:rPr>
+          <w:rFonts w:ascii="Times New Roman" w:hAnsi="Times New Roman" w:cs="Times New Roman"/>
+          <w:sz w:val="28"/>
+          <w:szCs w:val="28"/>
+        </w:rPr>
+        <w:t>Иерархию текстовых блоков.</w:t>
+      </w:r>
+    </w:p>
+    <w:p>
+      <w:pPr>
+        <w:tabs>
+          <w:tab w:val="left" w:pos="993"/>
+        </w:tabs>
+        <w:spacing w:after="0" w:line="240" w:lineRule="auto"/>
+        <w:jc w:val="both"/>
+        <w:rPr>
+          <w:rFonts w:ascii="Times New Roman" w:hAnsi="Times New Roman" w:cs="Times New Roman"/>
+          <w:sz w:val="28"/>
+          <w:szCs w:val="28"/>
+          <w:lang w:val="en-US"/>
+        </w:rPr>
+      </w:pPr>
+    </w:p>
+    <w:p>
+      <w:pPr>
         <w:pStyle w:val="a3"/>
         <w:numPr>
           <w:ilvl w:val="0"/>
@@ -5633,6 +5963,28 @@
     </w:p>
     <w:p>
       <w:pPr>
+        <w:tabs>
+          <w:tab w:val="left" w:pos="1134"/>
+        </w:tabs>
+        <w:spacing w:before="240" w:after="240" w:line="240" w:lineRule="auto"/>
+        <w:jc w:val="both"/>
+        <w:rPr>
+          <w:rFonts w:ascii="Times New Roman" w:hAnsi="Times New Roman" w:cs="Times New Roman"/>
+          <w:sz w:val="28"/>
+          <w:szCs w:val="28"/>
+        </w:rPr>
+      </w:pPr>
+      <w:r>
+        <w:rPr>
+          <w:rFonts w:ascii="Times New Roman" w:hAnsi="Times New Roman" w:cs="Times New Roman"/>
+          <w:sz w:val="28"/>
+          <w:szCs w:val="28"/>
+        </w:rPr>
+        <w:t>Интерлиньяж — это междустрочный интервал. Его увеличение может повысить удобочитаемость текста.</w:t>
+      </w:r>
+    </w:p>
+    <w:p>
+      <w:pPr>
         <w:pStyle w:val="a3"/>
         <w:numPr>
           <w:ilvl w:val="0"/>
@@ -5669,6 +6021,28 @@
     </w:p>
     <w:p>
       <w:pPr>
+        <w:tabs>
+          <w:tab w:val="left" w:pos="1134"/>
+        </w:tabs>
+        <w:spacing w:before="240" w:after="240" w:line="240" w:lineRule="auto"/>
+        <w:jc w:val="both"/>
+        <w:rPr>
+          <w:rFonts w:ascii="Times New Roman" w:hAnsi="Times New Roman" w:cs="Times New Roman"/>
+          <w:sz w:val="28"/>
+          <w:szCs w:val="28"/>
+        </w:rPr>
+      </w:pPr>
+      <w:r>
+        <w:rPr>
+          <w:rFonts w:ascii="Times New Roman" w:hAnsi="Times New Roman" w:cs="Times New Roman"/>
+          <w:sz w:val="28"/>
+          <w:szCs w:val="28"/>
+        </w:rPr>
+        <w:t>Негативное пространство — это свободное пространство между элементами интерфейса и вокруг них. Оно разгружает дизайн, помогает сосредоточиться на главном и улучшает восприятие контента.</w:t>
+      </w:r>
+    </w:p>
+    <w:p>
+      <w:pPr>
         <w:pStyle w:val="a3"/>
         <w:numPr>
           <w:ilvl w:val="0"/>
@@ -5697,6 +6071,28 @@
     </w:p>
     <w:p>
       <w:pPr>
+        <w:tabs>
+          <w:tab w:val="left" w:pos="1134"/>
+        </w:tabs>
+        <w:spacing w:before="240" w:after="240" w:line="240" w:lineRule="auto"/>
+        <w:jc w:val="both"/>
+        <w:rPr>
+          <w:rFonts w:ascii="Times New Roman" w:hAnsi="Times New Roman" w:cs="Times New Roman"/>
+          <w:sz w:val="28"/>
+          <w:szCs w:val="28"/>
+        </w:rPr>
+      </w:pPr>
+      <w:r>
+        <w:rPr>
+          <w:rFonts w:ascii="Times New Roman" w:hAnsi="Times New Roman" w:cs="Times New Roman"/>
+          <w:sz w:val="28"/>
+          <w:szCs w:val="28"/>
+        </w:rPr>
+        <w:t>Паттерны сканирования — это траектории, по которым пользователь просматривает и считывает информацию на странице. Ключевой контент рекомендуется размещать по этим траекториям.</w:t>
+      </w:r>
+    </w:p>
+    <w:p>
+      <w:pPr>
         <w:pStyle w:val="a3"/>
         <w:numPr>
           <w:ilvl w:val="0"/>
@@ -5721,6 +6117,67 @@
           <w:szCs w:val="28"/>
         </w:rPr>
         <w:t>Какие есть виды паттернов сканирования?</w:t>
+      </w:r>
+    </w:p>
+    <w:p>
+      <w:pPr>
+        <w:spacing w:after="0" w:line="240" w:lineRule="auto"/>
+        <w:rPr>
+          <w:rFonts w:ascii="Times New Roman" w:eastAsia="Times New Roman" w:hAnsi="Times New Roman" w:cs="Times New Roman"/>
+          <w:sz w:val="24"/>
+          <w:szCs w:val="24"/>
+          <w:lang w:val="ru-BY" w:eastAsia="ru-BY"/>
+        </w:rPr>
+      </w:pPr>
+      <w:r>
+        <w:rPr>
+          <w:rFonts w:ascii="Times New Roman" w:eastAsia="Times New Roman" w:hAnsi="Symbol" w:cs="Times New Roman"/>
+          <w:sz w:val="24"/>
+          <w:szCs w:val="24"/>
+          <w:lang w:val="ru-BY" w:eastAsia="ru-BY"/>
+        </w:rPr>
+        <w:t></w:t>
+      </w:r>
+      <w:r>
+        <w:rPr>
+          <w:rFonts w:ascii="Times New Roman" w:eastAsia="Times New Roman" w:hAnsi="Times New Roman" w:cs="Times New Roman"/>
+          <w:sz w:val="24"/>
+          <w:szCs w:val="24"/>
+          <w:lang w:val="ru-BY" w:eastAsia="ru-BY"/>
+        </w:rPr>
+        <w:t xml:space="preserve">  F-паттерн; </w:t>
+      </w:r>
+    </w:p>
+    <w:p>
+      <w:pPr>
+        <w:tabs>
+          <w:tab w:val="left" w:pos="1134"/>
+        </w:tabs>
+        <w:spacing w:before="240" w:after="240" w:line="240" w:lineRule="auto"/>
+        <w:jc w:val="both"/>
+        <w:rPr>
+          <w:rFonts w:ascii="Times New Roman" w:hAnsi="Times New Roman" w:cs="Times New Roman"/>
+          <w:sz w:val="28"/>
+          <w:szCs w:val="28"/>
+        </w:rPr>
+      </w:pPr>
+      <w:r>
+        <w:rPr>
+          <w:rFonts w:ascii="Times New Roman" w:eastAsia="Times New Roman" w:hAnsi="Symbol" w:cs="Times New Roman"/>
+          <w:sz w:val="24"/>
+          <w:szCs w:val="24"/>
+          <w:lang w:val="ru-BY" w:eastAsia="ru-BY"/>
+        </w:rPr>
+        <w:t></w:t>
+      </w:r>
+      <w:r>
+        <w:rPr>
+          <w:rFonts w:ascii="Times New Roman" w:eastAsia="Times New Roman" w:hAnsi="Times New Roman" w:cs="Times New Roman"/>
+          <w:sz w:val="24"/>
+          <w:szCs w:val="24"/>
+          <w:lang w:val="ru-BY" w:eastAsia="ru-BY"/>
+        </w:rPr>
+        <w:t xml:space="preserve">  Z-паттерн.</w:t>
       </w:r>
     </w:p>
     <w:sectPr>
@@ -8674,11 +9131,11 @@
   <w:style w:type="paragraph" w:default="1" w:styleId="a">
     <w:name w:val="Normal"/>
     <w:qFormat/>
+    <w:rsid w:val="000A79C0"/>
   </w:style>
   <w:style w:type="character" w:default="1" w:styleId="a0">
     <w:name w:val="Default Paragraph Font"/>
     <w:uiPriority w:val="1"/>
-    <w:semiHidden/>
     <w:unhideWhenUsed/>
   </w:style>
   <w:style w:type="table" w:default="1" w:styleId="a1">

</xml_diff>